<commit_message>
feat: atualizar documentação e criar arquivo de catálogo JSON API com 30 treinos estruturados
</commit_message>
<xml_diff>
--- a/Documentacao_PlanoDeCorrida.docx
+++ b/Documentacao_PlanoDeCorrida.docx
@@ -28,7 +28,7 @@
           <w:color w:val="334155"/>
           <w:sz w:val="22"/>
         </w:rPr>
-        <w:t>Data: Julho de 2026 | Versão 2.0 | Arquitetura: React 18 + Vite + TailwindCSS</w:t>
+        <w:t>Data: Julho de 2026 | Versão 2.1 | Arquitetura: React 18 + Vite + TailwindCSS + JSON API</w:t>
       </w:r>
     </w:p>
     <w:p>
@@ -69,7 +69,7 @@
           <w:color w:val="10B981"/>
           <w:sz w:val="32"/>
         </w:rPr>
-        <w:t>2. Catálogo Oficial de 90 Treinos (v2.0)</w:t>
+        <w:t>2. Catálogo Oficial de 90 Treinos (v2.0) &amp; Estrutura JSON API (v2.1)</w:t>
       </w:r>
     </w:p>
     <w:p>
@@ -82,7 +82,7 @@
           <w:color w:val="334155"/>
           <w:sz w:val="22"/>
         </w:rPr>
-        <w:t>Para proporcionar máxima diversidade esportiva e engajamento, foram estruturados 30 treinos exclusivos para cada perfil de corredor dentro do arquivo workoutCatalog.js:</w:t>
+        <w:t>Para proporcionar máxima diversidade esportiva e engajamento, foram estruturados 30 treinos exclusivos em workoutCatalog.js e adicionalmente gerado o arquivo workouts_api_catalog.json contendo 30 treinos estruturados por contrato de API (id, level, title, total_duration_minutes, workout_type, phases e physiological_goal) com fases detalhadas de warmup, main_set e cooldown.</w:t>
       </w:r>
     </w:p>
     <w:p>
@@ -96,7 +96,7 @@
           <w:color w:val="F59E0B"/>
           <w:sz w:val="26"/>
         </w:rPr>
-        <w:t>Perfil Iniciante (30 Treinos)</w:t>
+        <w:t>Perfil Iniciante (10 Treinos Estruturados em JSON / 30 no Catálogo Geral)</w:t>
       </w:r>
     </w:p>
     <w:p>
@@ -109,7 +109,7 @@
           <w:color w:val="334155"/>
           <w:sz w:val="22"/>
         </w:rPr>
-        <w:t>1. Corrida Leve / Caminhada 1:1 (Run-Walk Base)</w:t>
+        <w:t>1. Adaptação Articular Run-Walk 1:1 (30 min - Continuo / PSE 3 a 5)</w:t>
       </w:r>
     </w:p>
     <w:p>
@@ -122,7 +122,7 @@
           <w:color w:val="334155"/>
           <w:sz w:val="22"/>
         </w:rPr>
-        <w:t>2. Corrida Leve / Caminhada 2:1 (Evolução Contínua)</w:t>
+        <w:t>2. Evolução Contínua Run-Walk 2:1 (35 min - Continuo / Zona 2)</w:t>
       </w:r>
     </w:p>
     <w:p>
@@ -135,7 +135,7 @@
           <w:color w:val="334155"/>
           <w:sz w:val="22"/>
         </w:rPr>
-        <w:t>3. Corrida Leve / Caminhada 3:1 (Consolidação Aeróbica)</w:t>
+        <w:t>3. Consolidação Aeróbica Run-Walk 3:1 (37 min - Continuo / Zona 2)</w:t>
       </w:r>
     </w:p>
     <w:p>
@@ -148,7 +148,7 @@
           <w:color w:val="334155"/>
           <w:sz w:val="22"/>
         </w:rPr>
-        <w:t>4. Corrida Contínua Zona 2 (Iniciação ao Trote Contínuo)</w:t>
+        <w:t>4. Iniciação ao Trote Contínuo 15 min (30 min - Continuo / 65-72% FCmáx)</w:t>
       </w:r>
     </w:p>
     <w:p>
@@ -161,7 +161,7 @@
           <w:color w:val="334155"/>
           <w:sz w:val="22"/>
         </w:rPr>
-        <w:t>5. Fartlek Lúdico por Tempo (Acelera e Desacelera)</w:t>
+        <w:t>5. Treino de Cadência e Passada Curta (32 min - Continuo / 180 SPM)</w:t>
       </w:r>
     </w:p>
     <w:p>
@@ -174,7 +174,7 @@
           <w:color w:val="334155"/>
           <w:sz w:val="22"/>
         </w:rPr>
-        <w:t>6. Fartlek nos Postes de Luz (Estímulo Visual na Rua)</w:t>
+        <w:t>6. Fartlek Lúdico de Adaptação (34 min - Intervalado / Zona 1 e 3)</w:t>
       </w:r>
     </w:p>
     <w:p>
@@ -187,7 +187,7 @@
           <w:color w:val="334155"/>
           <w:sz w:val="22"/>
         </w:rPr>
-        <w:t>7. Tiros Curtos Controlados (6x 100m posturados)</w:t>
+        <w:t>7. Tiros Curtos Neuromusculares na Reta (33 min - Intervalado / 6x 100m)</w:t>
       </w:r>
     </w:p>
     <w:p>
@@ -200,7 +200,7 @@
           <w:color w:val="334155"/>
           <w:sz w:val="22"/>
         </w:rPr>
-        <w:t>8. Treino de Subida Suave (Rampa Iniciante 4 a 6x 20s)</w:t>
+        <w:t>8. Treino de Força em Rampa Suave (35 min - Intervalado / 5x subida suave)</w:t>
       </w:r>
     </w:p>
     <w:p>
@@ -213,7 +213,7 @@
           <w:color w:val="334155"/>
           <w:sz w:val="22"/>
         </w:rPr>
-        <w:t>9. Tempo Run Adaptado (8 min contínuos ofegante controlado)</w:t>
+        <w:t>9. Iniciação ao Limiar Mini Tempo Run (36 min - Continuo / 2x 6 min em Zona 3)</w:t>
       </w:r>
     </w:p>
     <w:p>
@@ -226,267 +226,7 @@
           <w:color w:val="334155"/>
           <w:sz w:val="22"/>
         </w:rPr>
-        <w:t>10. Longão Progressivo Run-Walk (Resistência de Fim de Semana)</w:t>
-      </w:r>
-    </w:p>
-    <w:p>
-      <w:pPr>
-        <w:spacing w:after="80" w:line="276" w:lineRule="auto"/>
-      </w:pPr>
-      <w:r>
-        <w:rPr>
-          <w:rFonts w:ascii="Segoe UI" w:hAnsi="Segoe UI"/>
-          <w:color w:val="334155"/>
-          <w:sz w:val="22"/>
-        </w:rPr>
-        <w:t>11. Corrida Descalço na Grama / Areia Batida (Propriocepção)</w:t>
-      </w:r>
-    </w:p>
-    <w:p>
-      <w:pPr>
-        <w:spacing w:after="80" w:line="276" w:lineRule="auto"/>
-      </w:pPr>
-      <w:r>
-        <w:rPr>
-          <w:rFonts w:ascii="Segoe UI" w:hAnsi="Segoe UI"/>
-          <w:color w:val="334155"/>
-          <w:sz w:val="22"/>
-        </w:rPr>
-        <w:t>12. Treino de Cadência e Passada Curtinha (180 SPM)</w:t>
-      </w:r>
-    </w:p>
-    <w:p>
-      <w:pPr>
-        <w:spacing w:after="80" w:line="276" w:lineRule="auto"/>
-      </w:pPr>
-      <w:r>
-        <w:rPr>
-          <w:rFonts w:ascii="Segoe UI" w:hAnsi="Segoe UI"/>
-          <w:color w:val="334155"/>
-          <w:sz w:val="22"/>
-        </w:rPr>
-        <w:t>13. Progressão de Fim de Treino (Fast Finish Leve)</w:t>
-      </w:r>
-    </w:p>
-    <w:p>
-      <w:pPr>
-        <w:spacing w:after="80" w:line="276" w:lineRule="auto"/>
-      </w:pPr>
-      <w:r>
-        <w:rPr>
-          <w:rFonts w:ascii="Segoe UI" w:hAnsi="Segoe UI"/>
-          <w:color w:val="334155"/>
-          <w:sz w:val="22"/>
-        </w:rPr>
-        <w:t>14. Pirâmide Crescente de Tempo (1-2-3-2-1 min)</w:t>
-      </w:r>
-    </w:p>
-    <w:p>
-      <w:pPr>
-        <w:spacing w:after="80" w:line="276" w:lineRule="auto"/>
-      </w:pPr>
-      <w:r>
-        <w:rPr>
-          <w:rFonts w:ascii="Segoe UI" w:hAnsi="Segoe UI"/>
-          <w:color w:val="334155"/>
-          <w:sz w:val="22"/>
-        </w:rPr>
-        <w:t>15. Treino Regenerativo e Respiração Nasal</w:t>
-      </w:r>
-    </w:p>
-    <w:p>
-      <w:pPr>
-        <w:spacing w:after="80" w:line="276" w:lineRule="auto"/>
-      </w:pPr>
-      <w:r>
-        <w:rPr>
-          <w:rFonts w:ascii="Segoe UI" w:hAnsi="Segoe UI"/>
-          <w:color w:val="334155"/>
-          <w:sz w:val="22"/>
-        </w:rPr>
-        <w:t>16. Cross-Training de Baixo Impacto (Ciclismo / Bike Ergométrica)</w:t>
-      </w:r>
-    </w:p>
-    <w:p>
-      <w:pPr>
-        <w:spacing w:after="80" w:line="276" w:lineRule="auto"/>
-      </w:pPr>
-      <w:r>
-        <w:rPr>
-          <w:rFonts w:ascii="Segoe UI" w:hAnsi="Segoe UI"/>
-          <w:color w:val="334155"/>
-          <w:sz w:val="22"/>
-        </w:rPr>
-        <w:t>17. Cross-Training Aquático (Natação / Hidro-trote)</w:t>
-      </w:r>
-    </w:p>
-    <w:p>
-      <w:pPr>
-        <w:spacing w:after="80" w:line="276" w:lineRule="auto"/>
-      </w:pPr>
-      <w:r>
-        <w:rPr>
-          <w:rFonts w:ascii="Segoe UI" w:hAnsi="Segoe UI"/>
-          <w:color w:val="334155"/>
-          <w:sz w:val="22"/>
-        </w:rPr>
-        <w:t>18. Tiros em Ladeira com Foco Postural (Tronco Inclinado)</w:t>
-      </w:r>
-    </w:p>
-    <w:p>
-      <w:pPr>
-        <w:spacing w:after="80" w:line="276" w:lineRule="auto"/>
-      </w:pPr>
-      <w:r>
-        <w:rPr>
-          <w:rFonts w:ascii="Segoe UI" w:hAnsi="Segoe UI"/>
-          <w:color w:val="334155"/>
-          <w:sz w:val="22"/>
-        </w:rPr>
-        <w:t>19. Intervalado 400m Moderado (Iniciação à Pista de Atletismo)</w:t>
-      </w:r>
-    </w:p>
-    <w:p>
-      <w:pPr>
-        <w:spacing w:after="80" w:line="276" w:lineRule="auto"/>
-      </w:pPr>
-      <w:r>
-        <w:rPr>
-          <w:rFonts w:ascii="Segoe UI" w:hAnsi="Segoe UI"/>
-          <w:color w:val="334155"/>
-          <w:sz w:val="22"/>
-        </w:rPr>
-        <w:t>20. Corrida Contínua com Educativos Pré-Treino (Skiping/Anfersen)</w:t>
-      </w:r>
-    </w:p>
-    <w:p>
-      <w:pPr>
-        <w:spacing w:after="80" w:line="276" w:lineRule="auto"/>
-      </w:pPr>
-      <w:r>
-        <w:rPr>
-          <w:rFonts w:ascii="Segoe UI" w:hAnsi="Segoe UI"/>
-          <w:color w:val="334155"/>
-          <w:sz w:val="22"/>
-        </w:rPr>
-        <w:t>21. Longão Contínuo de Conquista (Sem Paradas 30 a 45 min)</w:t>
-      </w:r>
-    </w:p>
-    <w:p>
-      <w:pPr>
-        <w:spacing w:after="80" w:line="276" w:lineRule="auto"/>
-      </w:pPr>
-      <w:r>
-        <w:rPr>
-          <w:rFonts w:ascii="Segoe UI" w:hAnsi="Segoe UI"/>
-          <w:color w:val="334155"/>
-          <w:sz w:val="22"/>
-        </w:rPr>
-        <w:t>22. Treino de Trocas de Ritmo no Terreno (Trilha Leve/Parque)</w:t>
-      </w:r>
-    </w:p>
-    <w:p>
-      <w:pPr>
-        <w:spacing w:after="80" w:line="276" w:lineRule="auto"/>
-      </w:pPr>
-      <w:r>
-        <w:rPr>
-          <w:rFonts w:ascii="Segoe UI" w:hAnsi="Segoe UI"/>
-          <w:color w:val="334155"/>
-          <w:sz w:val="22"/>
-        </w:rPr>
-        <w:t>23. Tempo Run em Blocos (2x 5 minutos com recuperação)</w:t>
-      </w:r>
-    </w:p>
-    <w:p>
-      <w:pPr>
-        <w:spacing w:after="80" w:line="276" w:lineRule="auto"/>
-      </w:pPr>
-      <w:r>
-        <w:rPr>
-          <w:rFonts w:ascii="Segoe UI" w:hAnsi="Segoe UI"/>
-          <w:color w:val="334155"/>
-          <w:sz w:val="22"/>
-        </w:rPr>
-        <w:t>24. Intervalado de Oxigenação (6x 200m descontraídos)</w:t>
-      </w:r>
-    </w:p>
-    <w:p>
-      <w:pPr>
-        <w:spacing w:after="80" w:line="276" w:lineRule="auto"/>
-      </w:pPr>
-      <w:r>
-        <w:rPr>
-          <w:rFonts w:ascii="Segoe UI" w:hAnsi="Segoe UI"/>
-          <w:color w:val="334155"/>
-          <w:sz w:val="22"/>
-        </w:rPr>
-        <w:t>25. Trote Social / Corrida em Grupo com Parceiro</w:t>
-      </w:r>
-    </w:p>
-    <w:p>
-      <w:pPr>
-        <w:spacing w:after="80" w:line="276" w:lineRule="auto"/>
-      </w:pPr>
-      <w:r>
-        <w:rPr>
-          <w:rFonts w:ascii="Segoe UI" w:hAnsi="Segoe UI"/>
-          <w:color w:val="334155"/>
-          <w:sz w:val="22"/>
-        </w:rPr>
-        <w:t>26. Subida Longa e Constante (3x 1 minuto controlado)</w:t>
-      </w:r>
-    </w:p>
-    <w:p>
-      <w:pPr>
-        <w:spacing w:after="80" w:line="276" w:lineRule="auto"/>
-      </w:pPr>
-      <w:r>
-        <w:rPr>
-          <w:rFonts w:ascii="Segoe UI" w:hAnsi="Segoe UI"/>
-          <w:color w:val="334155"/>
-          <w:sz w:val="22"/>
-        </w:rPr>
-        <w:t>27. Fartlek Crescente (1, 2 e 3 minutos fortes)</w:t>
-      </w:r>
-    </w:p>
-    <w:p>
-      <w:pPr>
-        <w:spacing w:after="80" w:line="276" w:lineRule="auto"/>
-      </w:pPr>
-      <w:r>
-        <w:rPr>
-          <w:rFonts w:ascii="Segoe UI" w:hAnsi="Segoe UI"/>
-          <w:color w:val="334155"/>
-          <w:sz w:val="22"/>
-        </w:rPr>
-        <w:t>28. Corrida com Variação de Zonas (Z1 a Z3)</w:t>
-      </w:r>
-    </w:p>
-    <w:p>
-      <w:pPr>
-        <w:spacing w:after="80" w:line="276" w:lineRule="auto"/>
-      </w:pPr>
-      <w:r>
-        <w:rPr>
-          <w:rFonts w:ascii="Segoe UI" w:hAnsi="Segoe UI"/>
-          <w:color w:val="334155"/>
-          <w:sz w:val="22"/>
-        </w:rPr>
-        <w:t>29. Longão de Resistência Mental e Hidratação em Movimento</w:t>
-      </w:r>
-    </w:p>
-    <w:p>
-      <w:pPr>
-        <w:spacing w:after="80" w:line="276" w:lineRule="auto"/>
-      </w:pPr>
-      <w:r>
-        <w:rPr>
-          <w:rFonts w:ascii="Segoe UI" w:hAnsi="Segoe UI"/>
-          <w:color w:val="334155"/>
-          <w:sz w:val="22"/>
-        </w:rPr>
-        <w:t>30. Treino de Celebração de Base (5 km contínuos de Formatura)</w:t>
+        <w:t>10. Longão de Conquista Aeróbica 25 min (40 min - Longo / Zona 2 estável)</w:t>
       </w:r>
     </w:p>
     <w:p>
@@ -500,7 +240,7 @@
           <w:color w:val="F59E0B"/>
           <w:sz w:val="26"/>
         </w:rPr>
-        <w:t>Perfil Intermediário (30 Treinos)</w:t>
+        <w:t>Perfil Intermediário (10 Treinos Estruturados em JSON / 30 no Catálogo Geral)</w:t>
       </w:r>
     </w:p>
     <w:p>
@@ -513,7 +253,7 @@
           <w:color w:val="334155"/>
           <w:sz w:val="22"/>
         </w:rPr>
-        <w:t>1. Corrida Aeróbica de Manutenção (Zona 2 Pura 45-60 min)</w:t>
+        <w:t>11. Volume Aeróbico de Base em Zona 2 (50 min - Continuo / 70-75% FCmáx)</w:t>
       </w:r>
     </w:p>
     <w:p>
@@ -526,7 +266,7 @@
           <w:color w:val="334155"/>
           <w:sz w:val="22"/>
         </w:rPr>
-        <w:t>2. Intervalado Clássico de VO2 Máximo (5x 1000m)</w:t>
+        <w:t>12. Intervalado Clássico de VO2 Máximo 5x1000m (55 min - Intervalado / Zona 4/5)</w:t>
       </w:r>
     </w:p>
     <w:p>
@@ -539,7 +279,7 @@
           <w:color w:val="334155"/>
           <w:sz w:val="22"/>
         </w:rPr>
-        <w:t>3. Tempo Run Contínuo no Limiar Anaeróbico (20 min contínuos)</w:t>
+        <w:t>13. Tempo Run no Limiar de Lactato 25 min (50 min - Continuo / 85-88% FCmáx)</w:t>
       </w:r>
     </w:p>
     <w:p>
@@ -552,7 +292,7 @@
           <w:color w:val="334155"/>
           <w:sz w:val="22"/>
         </w:rPr>
-        <w:t>4. Longão com Crescendo Final (Fast Finish Long Run)</w:t>
+        <w:t>14. Fartlek Piramidal de Velocidade (48 min - Intervalado / 1-2-3-2-1 min)</w:t>
       </w:r>
     </w:p>
     <w:p>
@@ -565,7 +305,7 @@
           <w:color w:val="334155"/>
           <w:sz w:val="22"/>
         </w:rPr>
-        <w:t>5. Fartlek Sueco (3-2-1-2-3 minutos regressivos e progressivos)</w:t>
+        <w:t>15. Hill Repeats Específicos de Força e Potência (45 min - Intervalado / 8x 45s)</w:t>
       </w:r>
     </w:p>
     <w:p>
@@ -578,7 +318,7 @@
           <w:color w:val="334155"/>
           <w:sz w:val="22"/>
         </w:rPr>
-        <w:t>6. Tiros Curtos de Velocidade e Economia (8x 400m)</w:t>
+        <w:t>16. Cruise Intervals no Limiar Fracionado 4x1500m (58 min - Intervalado / Zona 4)</w:t>
       </w:r>
     </w:p>
     <w:p>
@@ -591,7 +331,7 @@
           <w:color w:val="334155"/>
           <w:sz w:val="22"/>
         </w:rPr>
-        <w:t>7. Treino de Força Específica em Subida (Hill Repeats 8-10x 45s)</w:t>
+        <w:t>17. Tiros Curtos de Economia e Sprints 10x400m (50 min - Intervalado / Zona 5)</w:t>
       </w:r>
     </w:p>
     <w:p>
@@ -604,7 +344,7 @@
           <w:color w:val="334155"/>
           <w:sz w:val="22"/>
         </w:rPr>
-        <w:t>8. Cruise Intervals (4x 1500m no limiar de lactato)</w:t>
+        <w:t>18. Corrida Regenerativa de Descompressão (40 min - Regenerativo / Zona 1)</w:t>
       </w:r>
     </w:p>
     <w:p>
@@ -617,7 +357,7 @@
           <w:color w:val="334155"/>
           <w:sz w:val="22"/>
         </w:rPr>
-        <w:t>9. Longão em Terreno Acidentado (Rolling Hills Long Run)</w:t>
+        <w:t>19. Tempo Run Fracionado 3x8 min no Limiar (55 min - Intervalado / Zona 4)</w:t>
       </w:r>
     </w:p>
     <w:p>
@@ -630,267 +370,7 @@
           <w:color w:val="334155"/>
           <w:sz w:val="22"/>
         </w:rPr>
-        <w:t>10. Treino Progressivo de 3 Blocos (Terços em Z2, Z3 e Z4)</w:t>
-      </w:r>
-    </w:p>
-    <w:p>
-      <w:pPr>
-        <w:spacing w:after="80" w:line="276" w:lineRule="auto"/>
-      </w:pPr>
-      <w:r>
-        <w:rPr>
-          <w:rFonts w:ascii="Segoe UI" w:hAnsi="Segoe UI"/>
-          <w:color w:val="334155"/>
-          <w:sz w:val="22"/>
-        </w:rPr>
-        <w:t>11. Intervalado Curto de Explosão (12x 200m rápidos)</w:t>
-      </w:r>
-    </w:p>
-    <w:p>
-      <w:pPr>
-        <w:spacing w:after="80" w:line="276" w:lineRule="auto"/>
-      </w:pPr>
-      <w:r>
-        <w:rPr>
-          <w:rFonts w:ascii="Segoe UI" w:hAnsi="Segoe UI"/>
-          <w:color w:val="334155"/>
-          <w:sz w:val="22"/>
-        </w:rPr>
-        <w:t>12. Corrida Regenerativa de Descompressão (Recovery Run 24h pós-treino)</w:t>
-      </w:r>
-    </w:p>
-    <w:p>
-      <w:pPr>
-        <w:spacing w:after="80" w:line="276" w:lineRule="auto"/>
-      </w:pPr>
-      <w:r>
-        <w:rPr>
-          <w:rFonts w:ascii="Segoe UI" w:hAnsi="Segoe UI"/>
-          <w:color w:val="334155"/>
-          <w:sz w:val="22"/>
-        </w:rPr>
-        <w:t>13. Fartlek de Quêniano (12x 1 min rápido / 1 min trote sem caminhar)</w:t>
-      </w:r>
-    </w:p>
-    <w:p>
-      <w:pPr>
-        <w:spacing w:after="80" w:line="276" w:lineRule="auto"/>
-      </w:pPr>
-      <w:r>
-        <w:rPr>
-          <w:rFonts w:ascii="Segoe UI" w:hAnsi="Segoe UI"/>
-          <w:color w:val="334155"/>
-          <w:sz w:val="22"/>
-        </w:rPr>
-        <w:t>14. Tempo Run Fracionado (3x 8 minutos no limiar)</w:t>
-      </w:r>
-    </w:p>
-    <w:p>
-      <w:pPr>
-        <w:spacing w:after="80" w:line="276" w:lineRule="auto"/>
-      </w:pPr>
-      <w:r>
-        <w:rPr>
-          <w:rFonts w:ascii="Segoe UI" w:hAnsi="Segoe UI"/>
-          <w:color w:val="334155"/>
-          <w:sz w:val="22"/>
-        </w:rPr>
-        <w:t>15. Treino de Rampa Longa (5x 2 minutos subindo)</w:t>
-      </w:r>
-    </w:p>
-    <w:p>
-      <w:pPr>
-        <w:spacing w:after="80" w:line="276" w:lineRule="auto"/>
-      </w:pPr>
-      <w:r>
-        <w:rPr>
-          <w:rFonts w:ascii="Segoe UI" w:hAnsi="Segoe UI"/>
-          <w:color w:val="334155"/>
-          <w:sz w:val="22"/>
-        </w:rPr>
-        <w:t>16. Tiros Yasso 800m (Simulador de Meia/Maratona)</w:t>
-      </w:r>
-    </w:p>
-    <w:p>
-      <w:pPr>
-        <w:spacing w:after="80" w:line="276" w:lineRule="auto"/>
-      </w:pPr>
-      <w:r>
-        <w:rPr>
-          <w:rFonts w:ascii="Segoe UI" w:hAnsi="Segoe UI"/>
-          <w:color w:val="334155"/>
-          <w:sz w:val="22"/>
-        </w:rPr>
-        <w:t>17. Longão com Simulação de Nutrição e Gel de Carboidrato</w:t>
-      </w:r>
-    </w:p>
-    <w:p>
-      <w:pPr>
-        <w:spacing w:after="80" w:line="276" w:lineRule="auto"/>
-      </w:pPr>
-      <w:r>
-        <w:rPr>
-          <w:rFonts w:ascii="Segoe UI" w:hAnsi="Segoe UI"/>
-          <w:color w:val="334155"/>
-          <w:sz w:val="22"/>
-        </w:rPr>
-        <w:t>18. Cross-Training Aeróbico de Volume (Bike Cadência 90+ RPM)</w:t>
-      </w:r>
-    </w:p>
-    <w:p>
-      <w:pPr>
-        <w:spacing w:after="80" w:line="276" w:lineRule="auto"/>
-      </w:pPr>
-      <w:r>
-        <w:rPr>
-          <w:rFonts w:ascii="Segoe UI" w:hAnsi="Segoe UI"/>
-          <w:color w:val="334155"/>
-          <w:sz w:val="22"/>
-        </w:rPr>
-        <w:t>19. Intervalado Misto (1000m ritmo 10k + 400m ritmo 5k alternados)</w:t>
-      </w:r>
-    </w:p>
-    <w:p>
-      <w:pPr>
-        <w:spacing w:after="80" w:line="276" w:lineRule="auto"/>
-      </w:pPr>
-      <w:r>
-        <w:rPr>
-          <w:rFonts w:ascii="Segoe UI" w:hAnsi="Segoe UI"/>
-          <w:color w:val="334155"/>
-          <w:sz w:val="22"/>
-        </w:rPr>
-        <w:t>20. Corrida de Fundo com Foco de Cadência Rigorosa (180+ SPM)</w:t>
-      </w:r>
-    </w:p>
-    <w:p>
-      <w:pPr>
-        <w:spacing w:after="80" w:line="276" w:lineRule="auto"/>
-      </w:pPr>
-      <w:r>
-        <w:rPr>
-          <w:rFonts w:ascii="Segoe UI" w:hAnsi="Segoe UI"/>
-          <w:color w:val="334155"/>
-          <w:sz w:val="22"/>
-        </w:rPr>
-        <w:t>21. Treino de Fartlek Piramidal (1-2-3-4-3-2-1 min)</w:t>
-      </w:r>
-    </w:p>
-    <w:p>
-      <w:pPr>
-        <w:spacing w:after="80" w:line="276" w:lineRule="auto"/>
-      </w:pPr>
-      <w:r>
-        <w:rPr>
-          <w:rFonts w:ascii="Segoe UI" w:hAnsi="Segoe UI"/>
-          <w:color w:val="334155"/>
-          <w:sz w:val="22"/>
-        </w:rPr>
-        <w:t>22. Tempo Run em Ritmo de Meia Maratona (30 min cravados)</w:t>
-      </w:r>
-    </w:p>
-    <w:p>
-      <w:pPr>
-        <w:spacing w:after="80" w:line="276" w:lineRule="auto"/>
-      </w:pPr>
-      <w:r>
-        <w:rPr>
-          <w:rFonts w:ascii="Segoe UI" w:hAnsi="Segoe UI"/>
-          <w:color w:val="334155"/>
-          <w:sz w:val="22"/>
-        </w:rPr>
-        <w:t>23. Subidas Curtas Neuromusculares (10x 15s sprint máximo)</w:t>
-      </w:r>
-    </w:p>
-    <w:p>
-      <w:pPr>
-        <w:spacing w:after="80" w:line="276" w:lineRule="auto"/>
-      </w:pPr>
-      <w:r>
-        <w:rPr>
-          <w:rFonts w:ascii="Segoe UI" w:hAnsi="Segoe UI"/>
-          <w:color w:val="334155"/>
-          <w:sz w:val="22"/>
-        </w:rPr>
-        <w:t>24. Longão Negativado (Negative Split - 2ª metade mais rápida)</w:t>
-      </w:r>
-    </w:p>
-    <w:p>
-      <w:pPr>
-        <w:spacing w:after="80" w:line="276" w:lineRule="auto"/>
-      </w:pPr>
-      <w:r>
-        <w:rPr>
-          <w:rFonts w:ascii="Segoe UI" w:hAnsi="Segoe UI"/>
-          <w:color w:val="334155"/>
-          <w:sz w:val="22"/>
-        </w:rPr>
-        <w:t>25. Intervalado de 600m (8x 600m ágeis)</w:t>
-      </w:r>
-    </w:p>
-    <w:p>
-      <w:pPr>
-        <w:spacing w:after="80" w:line="276" w:lineRule="auto"/>
-      </w:pPr>
-      <w:r>
-        <w:rPr>
-          <w:rFonts w:ascii="Segoe UI" w:hAnsi="Segoe UI"/>
-          <w:color w:val="334155"/>
-          <w:sz w:val="22"/>
-        </w:rPr>
-        <w:t>26. Corrida Leve com Sprints Finais (Stsides 5x 80m)</w:t>
-      </w:r>
-    </w:p>
-    <w:p>
-      <w:pPr>
-        <w:spacing w:after="80" w:line="276" w:lineRule="auto"/>
-      </w:pPr>
-      <w:r>
-        <w:rPr>
-          <w:rFonts w:ascii="Segoe UI" w:hAnsi="Segoe UI"/>
-          <w:color w:val="334155"/>
-          <w:sz w:val="22"/>
-        </w:rPr>
-        <w:t>27. Treino de Limiar em Pista (2x 3000m ritmo 10k)</w:t>
-      </w:r>
-    </w:p>
-    <w:p>
-      <w:pPr>
-        <w:spacing w:after="80" w:line="276" w:lineRule="auto"/>
-      </w:pPr>
-      <w:r>
-        <w:rPr>
-          <w:rFonts w:ascii="Segoe UI" w:hAnsi="Segoe UI"/>
-          <w:color w:val="334155"/>
-          <w:sz w:val="22"/>
-        </w:rPr>
-        <w:t>28. Cross-Training com Remo / Elíptico de Baixo Impacto</w:t>
-      </w:r>
-    </w:p>
-    <w:p>
-      <w:pPr>
-        <w:spacing w:after="80" w:line="276" w:lineRule="auto"/>
-      </w:pPr>
-      <w:r>
-        <w:rPr>
-          <w:rFonts w:ascii="Segoe UI" w:hAnsi="Segoe UI"/>
-          <w:color w:val="334155"/>
-          <w:sz w:val="22"/>
-        </w:rPr>
-        <w:t>29. Longão de Especificidade e Resiliência de Pace no GPS</w:t>
-      </w:r>
-    </w:p>
-    <w:p>
-      <w:pPr>
-        <w:spacing w:after="80" w:line="276" w:lineRule="auto"/>
-      </w:pPr>
-      <w:r>
-        <w:rPr>
-          <w:rFonts w:ascii="Segoe UI" w:hAnsi="Segoe UI"/>
-          <w:color w:val="334155"/>
-          <w:sz w:val="22"/>
-        </w:rPr>
-        <w:t>30. Treino Teste de Desempenho (Simulação Real de 5k ou 10k)</w:t>
+        <w:t>20. Longão Progressivo com Fast Finish 14 km (80 min - Longo / 8k Z2 + 4k Z3)</w:t>
       </w:r>
     </w:p>
     <w:p>
@@ -904,7 +384,7 @@
           <w:color w:val="F59E0B"/>
           <w:sz w:val="26"/>
         </w:rPr>
-        <w:t>Perfil Avançado (30 Treinos)</w:t>
+        <w:t>Perfil Avançado (10 Treinos Estruturados em JSON / 30 no Catálogo Geral)</w:t>
       </w:r>
     </w:p>
     <w:p>
@@ -917,7 +397,7 @@
           <w:color w:val="334155"/>
           <w:sz w:val="22"/>
         </w:rPr>
-        <w:t>1. Intervalado Norueguês de Duplo Limiar (Sub-limiar 4x 2000m)</w:t>
+        <w:t>21. Intervalado Norueguês de Duplo Limiar 4x2000m (65 min - Intervalado / Sub-limiar)</w:t>
       </w:r>
     </w:p>
     <w:p>
@@ -930,7 +410,7 @@
           <w:color w:val="334155"/>
           <w:sz w:val="22"/>
         </w:rPr>
-        <w:t>2. Tiros de VO2 Máximo em Pista (10x 800m ritmo 5k)</w:t>
+        <w:t>22. Tiros de VO2 Máximo Severo em Pista 10x800m (65 min - Intervalado / &gt;93% FCmáx)</w:t>
       </w:r>
     </w:p>
     <w:p>
@@ -943,7 +423,7 @@
           <w:color w:val="334155"/>
           <w:sz w:val="22"/>
         </w:rPr>
-        <w:t>3. Longão Específico de Maratona (Marathon Pace Block Run)</w:t>
+        <w:t>23. Bloco Específico de Pace de Maratona 18 km (95 min - Longo / Marathon Pace)</w:t>
       </w:r>
     </w:p>
     <w:p>
@@ -956,7 +436,7 @@
           <w:color w:val="334155"/>
           <w:sz w:val="22"/>
         </w:rPr>
-        <w:t>4. Intervalado Láctico de Pista (15x 400m recuperação curta 60s)</w:t>
+        <w:t>24. Over-Under Tempo Run Alternado 6x(3+3 min) (68 min - Intervalado / MCT transportador)</w:t>
       </w:r>
     </w:p>
     <w:p>
@@ -969,7 +449,7 @@
           <w:color w:val="334155"/>
           <w:sz w:val="22"/>
         </w:rPr>
-        <w:t>5. Tempo Run Contínuo de Alta Intensidade (45 min na fronteira anaeróbica)</w:t>
+        <w:t>25. Intervalado Láctico de Pista 15x400m Curta Pausa (60 min - Intervalado / Pausa 60s)</w:t>
       </w:r>
     </w:p>
     <w:p>
@@ -982,7 +462,7 @@
           <w:color w:val="334155"/>
           <w:sz w:val="22"/>
         </w:rPr>
-        <w:t>6. Hill Repeats de Força Bruta (12x 1 minuto subida forte)</w:t>
+        <w:t>26. Hill Repeats de Força Bruta e VO2 12x1 min (62 min - Intervalado / 7% a 9% inclinação)</w:t>
       </w:r>
     </w:p>
     <w:p>
@@ -995,7 +475,7 @@
           <w:color w:val="334155"/>
           <w:sz w:val="22"/>
         </w:rPr>
-        <w:t>7. Fartlek Quêniano de Alto Volume (20x 1 forte / 1 aeróbico moderado)</w:t>
+        <w:t>27. Fartlek Quêniano de Volume 20x(1 min Forte / 1 min Moderado) (70 min - Intervalado)</w:t>
       </w:r>
     </w:p>
     <w:p>
@@ -1008,7 +488,7 @@
           <w:color w:val="334155"/>
           <w:sz w:val="22"/>
         </w:rPr>
-        <w:t>8. Longão Progressivo de 3 Fases (10k Leve + 10k Moderado + 8k Tempo)</w:t>
+        <w:t>28. Longão Progressivo de 3 Fases 24 km (115 min - Longo / 10k Z2 + 8k Z3 + 6k Z4)</w:t>
       </w:r>
     </w:p>
     <w:p>
@@ -1021,7 +501,7 @@
           <w:color w:val="334155"/>
           <w:sz w:val="22"/>
         </w:rPr>
-        <w:t>9. Intervalado Piramidal de Volume (400, 800, 1200, 1600, 1200...)</w:t>
+        <w:t>29. Cruise Intervals Extensos 3x4000m Ritmo Meia Maratona (75 min - Intervalado / Limiar)</w:t>
       </w:r>
     </w:p>
     <w:p>
@@ -1034,267 +514,7 @@
           <w:color w:val="334155"/>
           <w:sz w:val="22"/>
         </w:rPr>
-        <w:t>10. Over-Under Tempo Run (6x [3 min ritmo 5k + 3 min ritmo Meia])</w:t>
-      </w:r>
-    </w:p>
-    <w:p>
-      <w:pPr>
-        <w:spacing w:after="80" w:line="276" w:lineRule="auto"/>
-      </w:pPr>
-      <w:r>
-        <w:rPr>
-          <w:rFonts w:ascii="Segoe UI" w:hAnsi="Segoe UI"/>
-          <w:color w:val="334155"/>
-          <w:sz w:val="22"/>
-        </w:rPr>
-        <w:t>11. Tiros de Sprint Neuromuscular (16x 200m mecânica perfeita)</w:t>
-      </w:r>
-    </w:p>
-    <w:p>
-      <w:pPr>
-        <w:spacing w:after="80" w:line="276" w:lineRule="auto"/>
-      </w:pPr>
-      <w:r>
-        <w:rPr>
-          <w:rFonts w:ascii="Segoe UI" w:hAnsi="Segoe UI"/>
-          <w:color w:val="334155"/>
-          <w:sz w:val="22"/>
-        </w:rPr>
-        <w:t>12. Corrida Regenerativa Dupla (Doble-Threshold / Trote Matinal)</w:t>
-      </w:r>
-    </w:p>
-    <w:p>
-      <w:pPr>
-        <w:spacing w:after="80" w:line="276" w:lineRule="auto"/>
-      </w:pPr>
-      <w:r>
-        <w:rPr>
-          <w:rFonts w:ascii="Segoe UI" w:hAnsi="Segoe UI"/>
-          <w:color w:val="334155"/>
-          <w:sz w:val="22"/>
-        </w:rPr>
-        <w:t>13. Cruise Intervals Extensos (3x 4000m ritmo Meia Maratona)</w:t>
-      </w:r>
-    </w:p>
-    <w:p>
-      <w:pPr>
-        <w:spacing w:after="80" w:line="276" w:lineRule="auto"/>
-      </w:pPr>
-      <w:r>
-        <w:rPr>
-          <w:rFonts w:ascii="Segoe UI" w:hAnsi="Segoe UI"/>
-          <w:color w:val="334155"/>
-          <w:sz w:val="22"/>
-        </w:rPr>
-        <w:t>14. Hill Bounds (Saltos e Explosão em Ladeira 10x 30s)</w:t>
-      </w:r>
-    </w:p>
-    <w:p>
-      <w:pPr>
-        <w:spacing w:after="80" w:line="276" w:lineRule="auto"/>
-      </w:pPr>
-      <w:r>
-        <w:rPr>
-          <w:rFonts w:ascii="Segoe UI" w:hAnsi="Segoe UI"/>
-          <w:color w:val="334155"/>
-          <w:sz w:val="22"/>
-        </w:rPr>
-        <w:t>15. Yasso 800m Completo (10x 800m com conversão minutos/horas)</w:t>
-      </w:r>
-    </w:p>
-    <w:p>
-      <w:pPr>
-        <w:spacing w:after="80" w:line="276" w:lineRule="auto"/>
-      </w:pPr>
-      <w:r>
-        <w:rPr>
-          <w:rFonts w:ascii="Segoe UI" w:hAnsi="Segoe UI"/>
-          <w:color w:val="334155"/>
-          <w:sz w:val="22"/>
-        </w:rPr>
-        <w:t>16. Longão com Fadiga Acumulada e Carb-Depleted (Eficiência Lipídica)</w:t>
-      </w:r>
-    </w:p>
-    <w:p>
-      <w:pPr>
-        <w:spacing w:after="80" w:line="276" w:lineRule="auto"/>
-      </w:pPr>
-      <w:r>
-        <w:rPr>
-          <w:rFonts w:ascii="Segoe UI" w:hAnsi="Segoe UI"/>
-          <w:color w:val="334155"/>
-          <w:sz w:val="22"/>
-        </w:rPr>
-        <w:t>17. Tiros Descrescentes de Velocidade (2000 + 1500 + 1000 + 500m)</w:t>
-      </w:r>
-    </w:p>
-    <w:p>
-      <w:pPr>
-        <w:spacing w:after="80" w:line="276" w:lineRule="auto"/>
-      </w:pPr>
-      <w:r>
-        <w:rPr>
-          <w:rFonts w:ascii="Segoe UI" w:hAnsi="Segoe UI"/>
-          <w:color w:val="334155"/>
-          <w:sz w:val="22"/>
-        </w:rPr>
-        <w:t>18. Tempo Run em Terreno Ondulado (Rolling Hills Threshold)</w:t>
-      </w:r>
-    </w:p>
-    <w:p>
-      <w:pPr>
-        <w:spacing w:after="80" w:line="276" w:lineRule="auto"/>
-      </w:pPr>
-      <w:r>
-        <w:rPr>
-          <w:rFonts w:ascii="Segoe UI" w:hAnsi="Segoe UI"/>
-          <w:color w:val="334155"/>
-          <w:sz w:val="22"/>
-        </w:rPr>
-        <w:t>19. Cross-Training de Recuperação Ativa de Alto Volume (Ciclismo 90m)</w:t>
-      </w:r>
-    </w:p>
-    <w:p>
-      <w:pPr>
-        <w:spacing w:after="80" w:line="276" w:lineRule="auto"/>
-      </w:pPr>
-      <w:r>
-        <w:rPr>
-          <w:rFonts w:ascii="Segoe UI" w:hAnsi="Segoe UI"/>
-          <w:color w:val="334155"/>
-          <w:sz w:val="22"/>
-        </w:rPr>
-        <w:t>20. Intervalado Russo (30s forte / 30s trote contínuos por 30 minutos)</w:t>
-      </w:r>
-    </w:p>
-    <w:p>
-      <w:pPr>
-        <w:spacing w:after="80" w:line="276" w:lineRule="auto"/>
-      </w:pPr>
-      <w:r>
-        <w:rPr>
-          <w:rFonts w:ascii="Segoe UI" w:hAnsi="Segoe UI"/>
-          <w:color w:val="334155"/>
-          <w:sz w:val="22"/>
-        </w:rPr>
-        <w:t>21. Longão com Bloco Final no Limiar (22 km Z2 + 6 km Z4)</w:t>
-      </w:r>
-    </w:p>
-    <w:p>
-      <w:pPr>
-        <w:spacing w:after="80" w:line="276" w:lineRule="auto"/>
-      </w:pPr>
-      <w:r>
-        <w:rPr>
-          <w:rFonts w:ascii="Segoe UI" w:hAnsi="Segoe UI"/>
-          <w:color w:val="334155"/>
-          <w:sz w:val="22"/>
-        </w:rPr>
-        <w:t>22. Treino de Rampa Combinada (Subida + Reta Acelerada no Topo)</w:t>
-      </w:r>
-    </w:p>
-    <w:p>
-      <w:pPr>
-        <w:spacing w:after="80" w:line="276" w:lineRule="auto"/>
-      </w:pPr>
-      <w:r>
-        <w:rPr>
-          <w:rFonts w:ascii="Segoe UI" w:hAnsi="Segoe UI"/>
-          <w:color w:val="334155"/>
-          <w:sz w:val="22"/>
-        </w:rPr>
-        <w:t>23. Intervalado 1200m (6x 1200m sustentação de VO2)</w:t>
-      </w:r>
-    </w:p>
-    <w:p>
-      <w:pPr>
-        <w:spacing w:after="80" w:line="276" w:lineRule="auto"/>
-      </w:pPr>
-      <w:r>
-        <w:rPr>
-          <w:rFonts w:ascii="Segoe UI" w:hAnsi="Segoe UI"/>
-          <w:color w:val="334155"/>
-          <w:sz w:val="22"/>
-        </w:rPr>
-        <w:t>24. Corrida Leve Aeróbica de Volume (14 a 16 km fáceis)</w:t>
-      </w:r>
-    </w:p>
-    <w:p>
-      <w:pPr>
-        <w:spacing w:after="80" w:line="276" w:lineRule="auto"/>
-      </w:pPr>
-      <w:r>
-        <w:rPr>
-          <w:rFonts w:ascii="Segoe UI" w:hAnsi="Segoe UI"/>
-          <w:color w:val="334155"/>
-          <w:sz w:val="22"/>
-        </w:rPr>
-        <w:t>25. Fartlek Livre de Competição no Parque (8 picos de velocidade)</w:t>
-      </w:r>
-    </w:p>
-    <w:p>
-      <w:pPr>
-        <w:spacing w:after="80" w:line="276" w:lineRule="auto"/>
-      </w:pPr>
-      <w:r>
-        <w:rPr>
-          <w:rFonts w:ascii="Segoe UI" w:hAnsi="Segoe UI"/>
-          <w:color w:val="334155"/>
-          <w:sz w:val="22"/>
-        </w:rPr>
-        <w:t>26. Simulação de Meia Maratona em Treino (Time Trial 18 km)</w:t>
-      </w:r>
-    </w:p>
-    <w:p>
-      <w:pPr>
-        <w:spacing w:after="80" w:line="276" w:lineRule="auto"/>
-      </w:pPr>
-      <w:r>
-        <w:rPr>
-          <w:rFonts w:ascii="Segoe UI" w:hAnsi="Segoe UI"/>
-          <w:color w:val="334155"/>
-          <w:sz w:val="22"/>
-        </w:rPr>
-        <w:t>27. Tiros de 300m (15x 300m velocidade de pista)</w:t>
-      </w:r>
-    </w:p>
-    <w:p>
-      <w:pPr>
-        <w:spacing w:after="80" w:line="276" w:lineRule="auto"/>
-      </w:pPr>
-      <w:r>
-        <w:rPr>
-          <w:rFonts w:ascii="Segoe UI" w:hAnsi="Segoe UI"/>
-          <w:color w:val="334155"/>
-          <w:sz w:val="22"/>
-        </w:rPr>
-        <w:t>28. Treino de Transição (Brick / 40 min Bike + 10 km Corrida)</w:t>
-      </w:r>
-    </w:p>
-    <w:p>
-      <w:pPr>
-        <w:spacing w:after="80" w:line="276" w:lineRule="auto"/>
-      </w:pPr>
-      <w:r>
-        <w:rPr>
-          <w:rFonts w:ascii="Segoe UI" w:hAnsi="Segoe UI"/>
-          <w:color w:val="334155"/>
-          <w:sz w:val="22"/>
-        </w:rPr>
-        <w:t>29. Longão de Blindagem Mental (35 km Maratona Específico)</w:t>
-      </w:r>
-    </w:p>
-    <w:p>
-      <w:pPr>
-        <w:spacing w:after="80" w:line="276" w:lineRule="auto"/>
-      </w:pPr>
-      <w:r>
-        <w:rPr>
-          <w:rFonts w:ascii="Segoe UI" w:hAnsi="Segoe UI"/>
-          <w:color w:val="334155"/>
-          <w:sz w:val="22"/>
-        </w:rPr>
-        <w:t>30. Tapering Sharpener (Treino de Polimento e Afiação Pré-Prova)</w:t>
+        <w:t>30. Tapering Sharpener Polimento Pré-Prova (45 min - Intervalado / 6x 400m ritmo prova)</w:t>
       </w:r>
     </w:p>
     <w:p>

</xml_diff>

<commit_message>
refactor: remover todos os treinos do catálogo (vazio) conforme solicitado
</commit_message>
<xml_diff>
--- a/Documentacao_PlanoDeCorrida.docx
+++ b/Documentacao_PlanoDeCorrida.docx
@@ -28,7 +28,7 @@
           <w:color w:val="334155"/>
           <w:sz w:val="22"/>
         </w:rPr>
-        <w:t>Data: Julho de 2026 | Versão 2.1 | Arquitetura: React 18 + Vite + TailwindCSS + JSON API</w:t>
+        <w:t>Data: Julho de 2026 | Versão 2.3 | Arquitetura: React 18 + Vite + TailwindCSS</w:t>
       </w:r>
     </w:p>
     <w:p>
@@ -42,7 +42,7 @@
           <w:color w:val="10B981"/>
           <w:sz w:val="32"/>
         </w:rPr>
-        <w:t>1. Visão Geral do Aplicativo</w:t>
+        <w:t>1. Visão Geral do Aplicativo (v2.3)</w:t>
       </w:r>
     </w:p>
     <w:p>
@@ -60,20 +60,6 @@
     </w:p>
     <w:p>
       <w:pPr>
-        <w:spacing w:before="280" w:after="120"/>
-      </w:pPr>
-      <w:r>
-        <w:rPr>
-          <w:rFonts w:ascii="Segoe UI" w:hAnsi="Segoe UI"/>
-          <w:b/>
-          <w:color w:val="10B981"/>
-          <w:sz w:val="32"/>
-        </w:rPr>
-        <w:t>2. Catálogo Oficial de 90 Treinos (v2.0) &amp; Estrutura JSON API (v2.1)</w:t>
-      </w:r>
-    </w:p>
-    <w:p>
-      <w:pPr>
         <w:spacing w:after="80" w:line="276" w:lineRule="auto"/>
       </w:pPr>
       <w:r>
@@ -82,439 +68,7 @@
           <w:color w:val="334155"/>
           <w:sz w:val="22"/>
         </w:rPr>
-        <w:t>Para proporcionar máxima diversidade esportiva e engajamento, foram estruturados 30 treinos exclusivos em workoutCatalog.js e adicionalmente gerado o arquivo workouts_api_catalog.json contendo 30 treinos estruturados por contrato de API (id, level, title, total_duration_minutes, workout_type, phases e physiological_goal) com fases detalhadas de warmup, main_set e cooldown.</w:t>
-      </w:r>
-    </w:p>
-    <w:p>
-      <w:pPr>
-        <w:spacing w:before="200" w:after="80"/>
-      </w:pPr>
-      <w:r>
-        <w:rPr>
-          <w:rFonts w:ascii="Segoe UI" w:hAnsi="Segoe UI"/>
-          <w:b/>
-          <w:color w:val="F59E0B"/>
-          <w:sz w:val="26"/>
-        </w:rPr>
-        <w:t>Perfil Iniciante (10 Treinos Estruturados em JSON / 30 no Catálogo Geral)</w:t>
-      </w:r>
-    </w:p>
-    <w:p>
-      <w:pPr>
-        <w:spacing w:after="80" w:line="276" w:lineRule="auto"/>
-      </w:pPr>
-      <w:r>
-        <w:rPr>
-          <w:rFonts w:ascii="Segoe UI" w:hAnsi="Segoe UI"/>
-          <w:color w:val="334155"/>
-          <w:sz w:val="22"/>
-        </w:rPr>
-        <w:t>1. Adaptação Articular Run-Walk 1:1 (30 min - Continuo / PSE 3 a 5)</w:t>
-      </w:r>
-    </w:p>
-    <w:p>
-      <w:pPr>
-        <w:spacing w:after="80" w:line="276" w:lineRule="auto"/>
-      </w:pPr>
-      <w:r>
-        <w:rPr>
-          <w:rFonts w:ascii="Segoe UI" w:hAnsi="Segoe UI"/>
-          <w:color w:val="334155"/>
-          <w:sz w:val="22"/>
-        </w:rPr>
-        <w:t>2. Evolução Contínua Run-Walk 2:1 (35 min - Continuo / Zona 2)</w:t>
-      </w:r>
-    </w:p>
-    <w:p>
-      <w:pPr>
-        <w:spacing w:after="80" w:line="276" w:lineRule="auto"/>
-      </w:pPr>
-      <w:r>
-        <w:rPr>
-          <w:rFonts w:ascii="Segoe UI" w:hAnsi="Segoe UI"/>
-          <w:color w:val="334155"/>
-          <w:sz w:val="22"/>
-        </w:rPr>
-        <w:t>3. Consolidação Aeróbica Run-Walk 3:1 (37 min - Continuo / Zona 2)</w:t>
-      </w:r>
-    </w:p>
-    <w:p>
-      <w:pPr>
-        <w:spacing w:after="80" w:line="276" w:lineRule="auto"/>
-      </w:pPr>
-      <w:r>
-        <w:rPr>
-          <w:rFonts w:ascii="Segoe UI" w:hAnsi="Segoe UI"/>
-          <w:color w:val="334155"/>
-          <w:sz w:val="22"/>
-        </w:rPr>
-        <w:t>4. Iniciação ao Trote Contínuo 15 min (30 min - Continuo / 65-72% FCmáx)</w:t>
-      </w:r>
-    </w:p>
-    <w:p>
-      <w:pPr>
-        <w:spacing w:after="80" w:line="276" w:lineRule="auto"/>
-      </w:pPr>
-      <w:r>
-        <w:rPr>
-          <w:rFonts w:ascii="Segoe UI" w:hAnsi="Segoe UI"/>
-          <w:color w:val="334155"/>
-          <w:sz w:val="22"/>
-        </w:rPr>
-        <w:t>5. Treino de Cadência e Passada Curta (32 min - Continuo / 180 SPM)</w:t>
-      </w:r>
-    </w:p>
-    <w:p>
-      <w:pPr>
-        <w:spacing w:after="80" w:line="276" w:lineRule="auto"/>
-      </w:pPr>
-      <w:r>
-        <w:rPr>
-          <w:rFonts w:ascii="Segoe UI" w:hAnsi="Segoe UI"/>
-          <w:color w:val="334155"/>
-          <w:sz w:val="22"/>
-        </w:rPr>
-        <w:t>6. Fartlek Lúdico de Adaptação (34 min - Intervalado / Zona 1 e 3)</w:t>
-      </w:r>
-    </w:p>
-    <w:p>
-      <w:pPr>
-        <w:spacing w:after="80" w:line="276" w:lineRule="auto"/>
-      </w:pPr>
-      <w:r>
-        <w:rPr>
-          <w:rFonts w:ascii="Segoe UI" w:hAnsi="Segoe UI"/>
-          <w:color w:val="334155"/>
-          <w:sz w:val="22"/>
-        </w:rPr>
-        <w:t>7. Tiros Curtos Neuromusculares na Reta (33 min - Intervalado / 6x 100m)</w:t>
-      </w:r>
-    </w:p>
-    <w:p>
-      <w:pPr>
-        <w:spacing w:after="80" w:line="276" w:lineRule="auto"/>
-      </w:pPr>
-      <w:r>
-        <w:rPr>
-          <w:rFonts w:ascii="Segoe UI" w:hAnsi="Segoe UI"/>
-          <w:color w:val="334155"/>
-          <w:sz w:val="22"/>
-        </w:rPr>
-        <w:t>8. Treino de Força em Rampa Suave (35 min - Intervalado / 5x subida suave)</w:t>
-      </w:r>
-    </w:p>
-    <w:p>
-      <w:pPr>
-        <w:spacing w:after="80" w:line="276" w:lineRule="auto"/>
-      </w:pPr>
-      <w:r>
-        <w:rPr>
-          <w:rFonts w:ascii="Segoe UI" w:hAnsi="Segoe UI"/>
-          <w:color w:val="334155"/>
-          <w:sz w:val="22"/>
-        </w:rPr>
-        <w:t>9. Iniciação ao Limiar Mini Tempo Run (36 min - Continuo / 2x 6 min em Zona 3)</w:t>
-      </w:r>
-    </w:p>
-    <w:p>
-      <w:pPr>
-        <w:spacing w:after="80" w:line="276" w:lineRule="auto"/>
-      </w:pPr>
-      <w:r>
-        <w:rPr>
-          <w:rFonts w:ascii="Segoe UI" w:hAnsi="Segoe UI"/>
-          <w:color w:val="334155"/>
-          <w:sz w:val="22"/>
-        </w:rPr>
-        <w:t>10. Longão de Conquista Aeróbica 25 min (40 min - Longo / Zona 2 estável)</w:t>
-      </w:r>
-    </w:p>
-    <w:p>
-      <w:pPr>
-        <w:spacing w:before="200" w:after="80"/>
-      </w:pPr>
-      <w:r>
-        <w:rPr>
-          <w:rFonts w:ascii="Segoe UI" w:hAnsi="Segoe UI"/>
-          <w:b/>
-          <w:color w:val="F59E0B"/>
-          <w:sz w:val="26"/>
-        </w:rPr>
-        <w:t>Perfil Intermediário (10 Treinos Estruturados em JSON / 30 no Catálogo Geral)</w:t>
-      </w:r>
-    </w:p>
-    <w:p>
-      <w:pPr>
-        <w:spacing w:after="80" w:line="276" w:lineRule="auto"/>
-      </w:pPr>
-      <w:r>
-        <w:rPr>
-          <w:rFonts w:ascii="Segoe UI" w:hAnsi="Segoe UI"/>
-          <w:color w:val="334155"/>
-          <w:sz w:val="22"/>
-        </w:rPr>
-        <w:t>11. Volume Aeróbico de Base em Zona 2 (50 min - Continuo / 70-75% FCmáx)</w:t>
-      </w:r>
-    </w:p>
-    <w:p>
-      <w:pPr>
-        <w:spacing w:after="80" w:line="276" w:lineRule="auto"/>
-      </w:pPr>
-      <w:r>
-        <w:rPr>
-          <w:rFonts w:ascii="Segoe UI" w:hAnsi="Segoe UI"/>
-          <w:color w:val="334155"/>
-          <w:sz w:val="22"/>
-        </w:rPr>
-        <w:t>12. Intervalado Clássico de VO2 Máximo 5x1000m (55 min - Intervalado / Zona 4/5)</w:t>
-      </w:r>
-    </w:p>
-    <w:p>
-      <w:pPr>
-        <w:spacing w:after="80" w:line="276" w:lineRule="auto"/>
-      </w:pPr>
-      <w:r>
-        <w:rPr>
-          <w:rFonts w:ascii="Segoe UI" w:hAnsi="Segoe UI"/>
-          <w:color w:val="334155"/>
-          <w:sz w:val="22"/>
-        </w:rPr>
-        <w:t>13. Tempo Run no Limiar de Lactato 25 min (50 min - Continuo / 85-88% FCmáx)</w:t>
-      </w:r>
-    </w:p>
-    <w:p>
-      <w:pPr>
-        <w:spacing w:after="80" w:line="276" w:lineRule="auto"/>
-      </w:pPr>
-      <w:r>
-        <w:rPr>
-          <w:rFonts w:ascii="Segoe UI" w:hAnsi="Segoe UI"/>
-          <w:color w:val="334155"/>
-          <w:sz w:val="22"/>
-        </w:rPr>
-        <w:t>14. Fartlek Piramidal de Velocidade (48 min - Intervalado / 1-2-3-2-1 min)</w:t>
-      </w:r>
-    </w:p>
-    <w:p>
-      <w:pPr>
-        <w:spacing w:after="80" w:line="276" w:lineRule="auto"/>
-      </w:pPr>
-      <w:r>
-        <w:rPr>
-          <w:rFonts w:ascii="Segoe UI" w:hAnsi="Segoe UI"/>
-          <w:color w:val="334155"/>
-          <w:sz w:val="22"/>
-        </w:rPr>
-        <w:t>15. Hill Repeats Específicos de Força e Potência (45 min - Intervalado / 8x 45s)</w:t>
-      </w:r>
-    </w:p>
-    <w:p>
-      <w:pPr>
-        <w:spacing w:after="80" w:line="276" w:lineRule="auto"/>
-      </w:pPr>
-      <w:r>
-        <w:rPr>
-          <w:rFonts w:ascii="Segoe UI" w:hAnsi="Segoe UI"/>
-          <w:color w:val="334155"/>
-          <w:sz w:val="22"/>
-        </w:rPr>
-        <w:t>16. Cruise Intervals no Limiar Fracionado 4x1500m (58 min - Intervalado / Zona 4)</w:t>
-      </w:r>
-    </w:p>
-    <w:p>
-      <w:pPr>
-        <w:spacing w:after="80" w:line="276" w:lineRule="auto"/>
-      </w:pPr>
-      <w:r>
-        <w:rPr>
-          <w:rFonts w:ascii="Segoe UI" w:hAnsi="Segoe UI"/>
-          <w:color w:val="334155"/>
-          <w:sz w:val="22"/>
-        </w:rPr>
-        <w:t>17. Tiros Curtos de Economia e Sprints 10x400m (50 min - Intervalado / Zona 5)</w:t>
-      </w:r>
-    </w:p>
-    <w:p>
-      <w:pPr>
-        <w:spacing w:after="80" w:line="276" w:lineRule="auto"/>
-      </w:pPr>
-      <w:r>
-        <w:rPr>
-          <w:rFonts w:ascii="Segoe UI" w:hAnsi="Segoe UI"/>
-          <w:color w:val="334155"/>
-          <w:sz w:val="22"/>
-        </w:rPr>
-        <w:t>18. Corrida Regenerativa de Descompressão (40 min - Regenerativo / Zona 1)</w:t>
-      </w:r>
-    </w:p>
-    <w:p>
-      <w:pPr>
-        <w:spacing w:after="80" w:line="276" w:lineRule="auto"/>
-      </w:pPr>
-      <w:r>
-        <w:rPr>
-          <w:rFonts w:ascii="Segoe UI" w:hAnsi="Segoe UI"/>
-          <w:color w:val="334155"/>
-          <w:sz w:val="22"/>
-        </w:rPr>
-        <w:t>19. Tempo Run Fracionado 3x8 min no Limiar (55 min - Intervalado / Zona 4)</w:t>
-      </w:r>
-    </w:p>
-    <w:p>
-      <w:pPr>
-        <w:spacing w:after="80" w:line="276" w:lineRule="auto"/>
-      </w:pPr>
-      <w:r>
-        <w:rPr>
-          <w:rFonts w:ascii="Segoe UI" w:hAnsi="Segoe UI"/>
-          <w:color w:val="334155"/>
-          <w:sz w:val="22"/>
-        </w:rPr>
-        <w:t>20. Longão Progressivo com Fast Finish 14 km (80 min - Longo / 8k Z2 + 4k Z3)</w:t>
-      </w:r>
-    </w:p>
-    <w:p>
-      <w:pPr>
-        <w:spacing w:before="200" w:after="80"/>
-      </w:pPr>
-      <w:r>
-        <w:rPr>
-          <w:rFonts w:ascii="Segoe UI" w:hAnsi="Segoe UI"/>
-          <w:b/>
-          <w:color w:val="F59E0B"/>
-          <w:sz w:val="26"/>
-        </w:rPr>
-        <w:t>Perfil Avançado (10 Treinos Estruturados em JSON / 30 no Catálogo Geral)</w:t>
-      </w:r>
-    </w:p>
-    <w:p>
-      <w:pPr>
-        <w:spacing w:after="80" w:line="276" w:lineRule="auto"/>
-      </w:pPr>
-      <w:r>
-        <w:rPr>
-          <w:rFonts w:ascii="Segoe UI" w:hAnsi="Segoe UI"/>
-          <w:color w:val="334155"/>
-          <w:sz w:val="22"/>
-        </w:rPr>
-        <w:t>21. Intervalado Norueguês de Duplo Limiar 4x2000m (65 min - Intervalado / Sub-limiar)</w:t>
-      </w:r>
-    </w:p>
-    <w:p>
-      <w:pPr>
-        <w:spacing w:after="80" w:line="276" w:lineRule="auto"/>
-      </w:pPr>
-      <w:r>
-        <w:rPr>
-          <w:rFonts w:ascii="Segoe UI" w:hAnsi="Segoe UI"/>
-          <w:color w:val="334155"/>
-          <w:sz w:val="22"/>
-        </w:rPr>
-        <w:t>22. Tiros de VO2 Máximo Severo em Pista 10x800m (65 min - Intervalado / &gt;93% FCmáx)</w:t>
-      </w:r>
-    </w:p>
-    <w:p>
-      <w:pPr>
-        <w:spacing w:after="80" w:line="276" w:lineRule="auto"/>
-      </w:pPr>
-      <w:r>
-        <w:rPr>
-          <w:rFonts w:ascii="Segoe UI" w:hAnsi="Segoe UI"/>
-          <w:color w:val="334155"/>
-          <w:sz w:val="22"/>
-        </w:rPr>
-        <w:t>23. Bloco Específico de Pace de Maratona 18 km (95 min - Longo / Marathon Pace)</w:t>
-      </w:r>
-    </w:p>
-    <w:p>
-      <w:pPr>
-        <w:spacing w:after="80" w:line="276" w:lineRule="auto"/>
-      </w:pPr>
-      <w:r>
-        <w:rPr>
-          <w:rFonts w:ascii="Segoe UI" w:hAnsi="Segoe UI"/>
-          <w:color w:val="334155"/>
-          <w:sz w:val="22"/>
-        </w:rPr>
-        <w:t>24. Over-Under Tempo Run Alternado 6x(3+3 min) (68 min - Intervalado / MCT transportador)</w:t>
-      </w:r>
-    </w:p>
-    <w:p>
-      <w:pPr>
-        <w:spacing w:after="80" w:line="276" w:lineRule="auto"/>
-      </w:pPr>
-      <w:r>
-        <w:rPr>
-          <w:rFonts w:ascii="Segoe UI" w:hAnsi="Segoe UI"/>
-          <w:color w:val="334155"/>
-          <w:sz w:val="22"/>
-        </w:rPr>
-        <w:t>25. Intervalado Láctico de Pista 15x400m Curta Pausa (60 min - Intervalado / Pausa 60s)</w:t>
-      </w:r>
-    </w:p>
-    <w:p>
-      <w:pPr>
-        <w:spacing w:after="80" w:line="276" w:lineRule="auto"/>
-      </w:pPr>
-      <w:r>
-        <w:rPr>
-          <w:rFonts w:ascii="Segoe UI" w:hAnsi="Segoe UI"/>
-          <w:color w:val="334155"/>
-          <w:sz w:val="22"/>
-        </w:rPr>
-        <w:t>26. Hill Repeats de Força Bruta e VO2 12x1 min (62 min - Intervalado / 7% a 9% inclinação)</w:t>
-      </w:r>
-    </w:p>
-    <w:p>
-      <w:pPr>
-        <w:spacing w:after="80" w:line="276" w:lineRule="auto"/>
-      </w:pPr>
-      <w:r>
-        <w:rPr>
-          <w:rFonts w:ascii="Segoe UI" w:hAnsi="Segoe UI"/>
-          <w:color w:val="334155"/>
-          <w:sz w:val="22"/>
-        </w:rPr>
-        <w:t>27. Fartlek Quêniano de Volume 20x(1 min Forte / 1 min Moderado) (70 min - Intervalado)</w:t>
-      </w:r>
-    </w:p>
-    <w:p>
-      <w:pPr>
-        <w:spacing w:after="80" w:line="276" w:lineRule="auto"/>
-      </w:pPr>
-      <w:r>
-        <w:rPr>
-          <w:rFonts w:ascii="Segoe UI" w:hAnsi="Segoe UI"/>
-          <w:color w:val="334155"/>
-          <w:sz w:val="22"/>
-        </w:rPr>
-        <w:t>28. Longão Progressivo de 3 Fases 24 km (115 min - Longo / 10k Z2 + 8k Z3 + 6k Z4)</w:t>
-      </w:r>
-    </w:p>
-    <w:p>
-      <w:pPr>
-        <w:spacing w:after="80" w:line="276" w:lineRule="auto"/>
-      </w:pPr>
-      <w:r>
-        <w:rPr>
-          <w:rFonts w:ascii="Segoe UI" w:hAnsi="Segoe UI"/>
-          <w:color w:val="334155"/>
-          <w:sz w:val="22"/>
-        </w:rPr>
-        <w:t>29. Cruise Intervals Extensos 3x4000m Ritmo Meia Maratona (75 min - Intervalado / Limiar)</w:t>
-      </w:r>
-    </w:p>
-    <w:p>
-      <w:pPr>
-        <w:spacing w:after="80" w:line="276" w:lineRule="auto"/>
-      </w:pPr>
-      <w:r>
-        <w:rPr>
-          <w:rFonts w:ascii="Segoe UI" w:hAnsi="Segoe UI"/>
-          <w:color w:val="334155"/>
-          <w:sz w:val="22"/>
-        </w:rPr>
-        <w:t>30. Tapering Sharpener Polimento Pré-Prova (45 min - Intervalado / 6x 400m ritmo prova)</w:t>
+        <w:t>Na versão 2.3, por solicitação expressa de remoção de todos os treinos predefinidos, o catálogo foi esvaziado, mantendo a engine de cálculo de volume, paces e distâncias funcionando de forma limpa e modular.</w:t>
       </w:r>
     </w:p>
     <w:p>
@@ -528,7 +82,7 @@
           <w:color w:val="10B981"/>
           <w:sz w:val="32"/>
         </w:rPr>
-        <w:t>3. Regra Universal: Fortalecimento Opcional na Segunda-feira</w:t>
+        <w:t>2. Regra Universal: Fortalecimento Opcional na Segunda-feira</w:t>
       </w:r>
     </w:p>
     <w:p>

</xml_diff>

<commit_message>
feat: gerar banco de dados JSON com 90 treinos científicos e atualizar suporte e documentação v2.4
</commit_message>
<xml_diff>
--- a/Documentacao_PlanoDeCorrida.docx
+++ b/Documentacao_PlanoDeCorrida.docx
@@ -13,7 +13,7 @@
           <w:color w:val="10B981"/>
           <w:sz w:val="44"/>
         </w:rPr>
-        <w:t>DOCUMENTAÇÃO TÉCNICA DO SISTEMA</w:t>
+        <w:t>DOCUMENTAÇÃO TÉCNICA E CIENTÍFICA</w:t>
         <w:br/>
         <w:t>PLANO DE CORRIDA APP</w:t>
       </w:r>
@@ -28,7 +28,7 @@
           <w:color w:val="334155"/>
           <w:sz w:val="22"/>
         </w:rPr>
-        <w:t>Data: Julho de 2026 | Versão 2.3 | Arquitetura: React 18 + Vite + TailwindCSS</w:t>
+        <w:t>Data: Julho de 2026 | Versão 2.4 | Arquitetura: React 18 + Vite + TailwindCSS + Banco de Dados JSON API</w:t>
       </w:r>
     </w:p>
     <w:p>
@@ -42,7 +42,7 @@
           <w:color w:val="10B981"/>
           <w:sz w:val="32"/>
         </w:rPr>
-        <w:t>1. Visão Geral do Aplicativo (v2.3)</w:t>
+        <w:t>1. Visão Geral e Banco de Dados de 90 Treinos (v2.4)</w:t>
       </w:r>
     </w:p>
     <w:p>
@@ -55,7 +55,7 @@
           <w:color w:val="334155"/>
           <w:sz w:val="22"/>
         </w:rPr>
-        <w:t>O PlanoDeCorrida é uma plataforma web adaptativa de periodização esportiva que gera cronogramas de treinamento científicos e personalizados de acordo com o nível, idade e meta de distância (5K a 42K) do corredor.</w:t>
+        <w:t>O PlanoDeCorrida é uma plataforma web adaptativa de periodização esportiva para corredores de rua de todos os níveis. Na versão 2.4, foi gerado e estruturado o banco de dados oficial completo em src/lib/workouts_api_catalog.json contendo exatamente 90 planos de treinamento.</w:t>
       </w:r>
     </w:p>
     <w:p>
@@ -68,7 +68,7 @@
           <w:color w:val="334155"/>
           <w:sz w:val="22"/>
         </w:rPr>
-        <w:t>Na versão 2.3, por solicitação expressa de remoção de todos os treinos predefinidos, o catálogo foi esvaziado, mantendo a engine de cálculo de volume, paces e distâncias funcionando de forma limpa e modular.</w:t>
+        <w:t>Cada plano no banco JSON possui a seguinte estrutura de contrato: id (1 a 90), level ('iniciante', 'intermediario', 'avancado'), title, total_time_minutes, workout_type, structure (warmup, main_set, cooldown) e physiological_goal.</w:t>
       </w:r>
     </w:p>
     <w:p>
@@ -82,7 +82,21 @@
           <w:color w:val="10B981"/>
           <w:sz w:val="32"/>
         </w:rPr>
-        <w:t>2. Regra Universal: Fortalecimento Opcional na Segunda-feira</w:t>
+        <w:t>2. Perfil dos 90 Treinos Científicos</w:t>
+      </w:r>
+    </w:p>
+    <w:p>
+      <w:pPr>
+        <w:spacing w:before="200" w:after="80"/>
+      </w:pPr>
+      <w:r>
+        <w:rPr>
+          <w:rFonts w:ascii="Segoe UI" w:hAnsi="Segoe UI"/>
+          <w:b/>
+          <w:color w:val="F59E0B"/>
+          <w:sz w:val="26"/>
+        </w:rPr>
+        <w:t>Nível Iniciante (30 Treinos - ID 1 a 30)</w:t>
       </w:r>
     </w:p>
     <w:p>
@@ -95,7 +109,88 @@
           <w:color w:val="334155"/>
           <w:sz w:val="22"/>
         </w:rPr>
-        <w:t>Em trainingEngine.js e no WeekCard.jsx, a Segunda-feira foi padronizada para todos os níveis como Treino de Fortalecimento com marcação de ⭐ Opcional. Desta forma, o atleta que necessita de repouso após o longão de domingo não perde porcentagem no seu progresso semanal.</w:t>
+        <w:t>Foco em adaptação progressiva, alternância de caminhada/corrida com proporções controladas (1:1 a 3:1), iniciação ao trote contínuo (15 a 50 min), cadência alta de 180 passos/min para proteção articular contra overstriding, e introdução a Fartlek e subidas leves.</w:t>
+      </w:r>
+    </w:p>
+    <w:p>
+      <w:pPr>
+        <w:spacing w:before="200" w:after="80"/>
+      </w:pPr>
+      <w:r>
+        <w:rPr>
+          <w:rFonts w:ascii="Segoe UI" w:hAnsi="Segoe UI"/>
+          <w:b/>
+          <w:color w:val="F59E0B"/>
+          <w:sz w:val="26"/>
+        </w:rPr>
+        <w:t>Nível Intermediário (30 Treinos - ID 31 a 60)</w:t>
+      </w:r>
+    </w:p>
+    <w:p>
+      <w:pPr>
+        <w:spacing w:after="80" w:line="276" w:lineRule="auto"/>
+      </w:pPr>
+      <w:r>
+        <w:rPr>
+          <w:rFonts w:ascii="Segoe UI" w:hAnsi="Segoe UI"/>
+          <w:color w:val="334155"/>
+          <w:sz w:val="22"/>
+        </w:rPr>
+        <w:t>Foco no aumento do volume sustentável em Zona 2, introdução sólida a treinos de limiar anaeróbio (Tempo Run de 25 a 40 min), Fartlek piramidal e queniano, Cruise Intervals no ritmo de 10k/21k, e longões de 14 a 18 km com progressão de ritmo (Fast Finish).</w:t>
+      </w:r>
+    </w:p>
+    <w:p>
+      <w:pPr>
+        <w:spacing w:before="200" w:after="80"/>
+      </w:pPr>
+      <w:r>
+        <w:rPr>
+          <w:rFonts w:ascii="Segoe UI" w:hAnsi="Segoe UI"/>
+          <w:b/>
+          <w:color w:val="F59E0B"/>
+          <w:sz w:val="26"/>
+        </w:rPr>
+        <w:t>Nível Avançado (30 Treinos - ID 61 a 90)</w:t>
+      </w:r>
+    </w:p>
+    <w:p>
+      <w:pPr>
+        <w:spacing w:after="80" w:line="276" w:lineRule="auto"/>
+      </w:pPr>
+      <w:r>
+        <w:rPr>
+          <w:rFonts w:ascii="Segoe UI" w:hAnsi="Segoe UI"/>
+          <w:color w:val="334155"/>
+          <w:sz w:val="22"/>
+        </w:rPr>
+        <w:t>Foco em alta performance, intervalados rigorosos em pista com foco em VO2 máximo severo (10x800m, 15x400m, 6x1200m), Duplo Limiar Norueguês (4x2000m), Over-Under Tempo Runs, Hill Repeats de potência propulsiva e longões de 24 a 28 km com pace exato de maratona e polimento.</w:t>
+      </w:r>
+    </w:p>
+    <w:p>
+      <w:pPr>
+        <w:spacing w:before="280" w:after="120"/>
+      </w:pPr>
+      <w:r>
+        <w:rPr>
+          <w:rFonts w:ascii="Segoe UI" w:hAnsi="Segoe UI"/>
+          <w:b/>
+          <w:color w:val="10B981"/>
+          <w:sz w:val="32"/>
+        </w:rPr>
+        <w:t>3. Regra Universal: Fortalecimento Opcional na Segunda-feira</w:t>
+      </w:r>
+    </w:p>
+    <w:p>
+      <w:pPr>
+        <w:spacing w:after="80" w:line="276" w:lineRule="auto"/>
+      </w:pPr>
+      <w:r>
+        <w:rPr>
+          <w:rFonts w:ascii="Segoe UI" w:hAnsi="Segoe UI"/>
+          <w:color w:val="334155"/>
+          <w:sz w:val="22"/>
+        </w:rPr>
+        <w:t>Em trainingEngine.js e no WeekCard.jsx, a Segunda-feira foi padronizada para todos os níveis como Treino de Fortalecimento com marcação de ⭐ Opcional (`isOptional: true`). Desta forma, o atleta que necessita de repouso passivo após o longão de domingo não perde porcentagem no seu progresso semanal.</w:t>
       </w:r>
     </w:p>
     <w:sectPr>

</xml_diff>

<commit_message>
feat: remover 100% dos resquícios de treinos antigos e conectar catálogo aos 90 protocolos científicos (v2.5)
</commit_message>
<xml_diff>
--- a/Documentacao_PlanoDeCorrida.docx
+++ b/Documentacao_PlanoDeCorrida.docx
@@ -28,7 +28,7 @@
           <w:color w:val="334155"/>
           <w:sz w:val="22"/>
         </w:rPr>
-        <w:t>Data: Julho de 2026 | Versão 2.4 | Arquitetura: React 18 + Vite + TailwindCSS + Banco de Dados JSON API</w:t>
+        <w:t>Data: Julho de 2026 | Versão 2.5 (Erradicação de Treinos Legados) | Arquitetura: React 18 + Vite + JSON API</w:t>
       </w:r>
     </w:p>
     <w:p>
@@ -42,7 +42,7 @@
           <w:color w:val="10B981"/>
           <w:sz w:val="32"/>
         </w:rPr>
-        <w:t>1. Visão Geral e Banco de Dados de 90 Treinos (v2.4)</w:t>
+        <w:t>1. Erradicação Completa de Treinos Legados e Conexão JSON (v2.5)</w:t>
       </w:r>
     </w:p>
     <w:p>
@@ -55,7 +55,7 @@
           <w:color w:val="334155"/>
           <w:sz w:val="22"/>
         </w:rPr>
-        <w:t>O PlanoDeCorrida é uma plataforma web adaptativa de periodização esportiva para corredores de rua de todos os níveis. Na versão 2.4, foi gerado e estruturado o banco de dados oficial completo em src/lib/workouts_api_catalog.json contendo exatamente 90 planos de treinamento.</w:t>
+        <w:t>Na versão 2.5, foram eliminados todos os resquícios de treinos antigos ou genéricos que ficavam hardcoded no código fonte do motor de cálculo (trainingEngine.js) e em workoutCatalog.js. O sistema agora é 100% alimentado pelo banco de dados JSON (workouts_api_catalog.json) com 90 planos de treinamento científicos e periodizados.</w:t>
       </w:r>
     </w:p>
     <w:p>
@@ -68,7 +68,7 @@
           <w:color w:val="334155"/>
           <w:sz w:val="22"/>
         </w:rPr>
-        <w:t>Cada plano no banco JSON possui a seguinte estrutura de contrato: id (1 a 90), level ('iniciante', 'intermediario', 'avancado'), title, total_time_minutes, workout_type, structure (warmup, main_set, cooldown) e physiological_goal.</w:t>
+        <w:t>O catálogo normaliza dinamicamente as categorias da API (continuo, longo, intervalado, fartlek, tempo_run, hill_repeats) para os tipos semanais do motor (EASY, LONG, INTERVAL, TEMPO, HILL), garantindo que cada sessão gerada exiba pontualmente o Aquecimento, Parte Principal, Volta à Calma e Objetivo Biológico.</w:t>
       </w:r>
     </w:p>
     <w:p>
@@ -82,7 +82,7 @@
           <w:color w:val="10B981"/>
           <w:sz w:val="32"/>
         </w:rPr>
-        <w:t>2. Perfil dos 90 Treinos Científicos</w:t>
+        <w:t>2. Perfil dos 90 Treinos Científicos do Banco Oficial</w:t>
       </w:r>
     </w:p>
     <w:p>
@@ -109,7 +109,7 @@
           <w:color w:val="334155"/>
           <w:sz w:val="22"/>
         </w:rPr>
-        <w:t>Foco em adaptação progressiva, alternância de caminhada/corrida com proporções controladas (1:1 a 3:1), iniciação ao trote contínuo (15 a 50 min), cadência alta de 180 passos/min para proteção articular contra overstriding, e introdução a Fartlek e subidas leves.</w:t>
+        <w:t>Foco em adaptação articular progressiva, alternância de caminhada e corrida (Run-Walk nas proporções 1:1, 2:1 e 3:1), iniciação ao trote contínuo em Zona 2, cadência de proteção articular (180 SPM) e introdução a Fartlek e subidas leves.</w:t>
       </w:r>
     </w:p>
     <w:p>
@@ -136,7 +136,7 @@
           <w:color w:val="334155"/>
           <w:sz w:val="22"/>
         </w:rPr>
-        <w:t>Foco no aumento do volume sustentável em Zona 2, introdução sólida a treinos de limiar anaeróbio (Tempo Run de 25 a 40 min), Fartlek piramidal e queniano, Cruise Intervals no ritmo de 10k/21k, e longões de 14 a 18 km com progressão de ritmo (Fast Finish).</w:t>
+        <w:t>Foco no aumento do volume sustentável em Zona 2, introdução a treinos no limiar de lactato (Tempo Run contínuo e fracionado), Fartlek piramidal e queniano, Cruise Intervals no ritmo de 10k/21k e longões com progressão de ritmo (Fast Finish).</w:t>
       </w:r>
     </w:p>
     <w:p>
@@ -163,7 +163,7 @@
           <w:color w:val="334155"/>
           <w:sz w:val="22"/>
         </w:rPr>
-        <w:t>Foco em alta performance, intervalados rigorosos em pista com foco em VO2 máximo severo (10x800m, 15x400m, 6x1200m), Duplo Limiar Norueguês (4x2000m), Over-Under Tempo Runs, Hill Repeats de potência propulsiva e longões de 24 a 28 km com pace exato de maratona e polimento.</w:t>
+        <w:t>Foco em máxima performance, intervalados em pista visando VO2 máximo severo (10x800m, 15x400m), Duplo Limiar Norueguês (4x2000m), Over-Under Tempo Runs, Hill Repeats explosivos e longões estruturados no pace exato de maratona e polimento.</w:t>
       </w:r>
     </w:p>
     <w:p>
@@ -177,7 +177,7 @@
           <w:color w:val="10B981"/>
           <w:sz w:val="32"/>
         </w:rPr>
-        <w:t>3. Regra Universal: Fortalecimento Opcional na Segunda-feira</w:t>
+        <w:t>3. Regra Universal: Fortalecimento Opcional nas Segundas-feiras</w:t>
       </w:r>
     </w:p>
     <w:p>
@@ -190,7 +190,7 @@
           <w:color w:val="334155"/>
           <w:sz w:val="22"/>
         </w:rPr>
-        <w:t>Em trainingEngine.js e no WeekCard.jsx, a Segunda-feira foi padronizada para todos os níveis como Treino de Fortalecimento com marcação de ⭐ Opcional (`isOptional: true`). Desta forma, o atleta que necessita de repouso passivo após o longão de domingo não perde porcentagem no seu progresso semanal.</w:t>
+        <w:t>A Segunda-feira de todos os planos está configurada com o Treino de Fortalecimento Funcional e Mobilidade com marcação de ⭐ Opcional (`isOptional: true`). Dessa forma, o atleta obtém suporte biomecânico contra lesões caso treine, ou descanso completo sem perda de porcentagem no progresso semanal.</w:t>
       </w:r>
     </w:p>
     <w:sectPr>

</xml_diff>

<commit_message>
feat: apagar todos os treinos do catálogo JSON (v2.6)
</commit_message>
<xml_diff>
--- a/Documentacao_PlanoDeCorrida.docx
+++ b/Documentacao_PlanoDeCorrida.docx
@@ -28,7 +28,7 @@
           <w:color w:val="334155"/>
           <w:sz w:val="22"/>
         </w:rPr>
-        <w:t>Data: Julho de 2026 | Versão 2.5 (Erradicação de Treinos Legados) | Arquitetura: React 18 + Vite + JSON API</w:t>
+        <w:t>Data: Julho de 2026 | Versão 2.6 (Esvaziamento do Catálogo de Treinos) | Arquitetura: React 18 + Vite + JSON API</w:t>
       </w:r>
     </w:p>
     <w:p>
@@ -42,7 +42,7 @@
           <w:color w:val="10B981"/>
           <w:sz w:val="32"/>
         </w:rPr>
-        <w:t>1. Erradicação Completa de Treinos Legados e Conexão JSON (v2.5)</w:t>
+        <w:t>1. Esvaziamento e Limpeza do Catálogo (v2.6)</w:t>
       </w:r>
     </w:p>
     <w:p>
@@ -55,20 +55,7 @@
           <w:color w:val="334155"/>
           <w:sz w:val="22"/>
         </w:rPr>
-        <w:t>Na versão 2.5, foram eliminados todos os resquícios de treinos antigos ou genéricos que ficavam hardcoded no código fonte do motor de cálculo (trainingEngine.js) e em workoutCatalog.js. O sistema agora é 100% alimentado pelo banco de dados JSON (workouts_api_catalog.json) com 90 planos de treinamento científicos e periodizados.</w:t>
-      </w:r>
-    </w:p>
-    <w:p>
-      <w:pPr>
-        <w:spacing w:after="80" w:line="276" w:lineRule="auto"/>
-      </w:pPr>
-      <w:r>
-        <w:rPr>
-          <w:rFonts w:ascii="Segoe UI" w:hAnsi="Segoe UI"/>
-          <w:color w:val="334155"/>
-          <w:sz w:val="22"/>
-        </w:rPr>
-        <w:t>O catálogo normaliza dinamicamente as categorias da API (continuo, longo, intervalado, fartlek, tempo_run, hill_repeats) para os tipos semanais do motor (EASY, LONG, INTERVAL, TEMPO, HILL), garantindo que cada sessão gerada exiba pontualmente o Aquecimento, Parte Principal, Volta à Calma e Objetivo Biológico.</w:t>
+        <w:t>Na versão 2.6, conforme solicitado, todos os treinos do catálogo foram apagados (workouts: []) em workouts_api_catalog.json. O sistema mantém sua arquitetura limpa e pronta para receber uma nova alimentação de dados JSON sem gerar erros na interface ou na compilação.</w:t>
       </w:r>
     </w:p>
     <w:p>
@@ -82,21 +69,7 @@
           <w:color w:val="10B981"/>
           <w:sz w:val="32"/>
         </w:rPr>
-        <w:t>2. Perfil dos 90 Treinos Científicos do Banco Oficial</w:t>
-      </w:r>
-    </w:p>
-    <w:p>
-      <w:pPr>
-        <w:spacing w:before="200" w:after="80"/>
-      </w:pPr>
-      <w:r>
-        <w:rPr>
-          <w:rFonts w:ascii="Segoe UI" w:hAnsi="Segoe UI"/>
-          <w:b/>
-          <w:color w:val="F59E0B"/>
-          <w:sz w:val="26"/>
-        </w:rPr>
-        <w:t>Nível Iniciante (30 Treinos - ID 1 a 30)</w:t>
+        <w:t>2. Estrutura Base de Fallback do Motor de Treinamento</w:t>
       </w:r>
     </w:p>
     <w:p>
@@ -109,61 +82,7 @@
           <w:color w:val="334155"/>
           <w:sz w:val="22"/>
         </w:rPr>
-        <w:t>Foco em adaptação articular progressiva, alternância de caminhada e corrida (Run-Walk nas proporções 1:1, 2:1 e 3:1), iniciação ao trote contínuo em Zona 2, cadência de proteção articular (180 SPM) e introdução a Fartlek e subidas leves.</w:t>
-      </w:r>
-    </w:p>
-    <w:p>
-      <w:pPr>
-        <w:spacing w:before="200" w:after="80"/>
-      </w:pPr>
-      <w:r>
-        <w:rPr>
-          <w:rFonts w:ascii="Segoe UI" w:hAnsi="Segoe UI"/>
-          <w:b/>
-          <w:color w:val="F59E0B"/>
-          <w:sz w:val="26"/>
-        </w:rPr>
-        <w:t>Nível Intermediário (30 Treinos - ID 31 a 60)</w:t>
-      </w:r>
-    </w:p>
-    <w:p>
-      <w:pPr>
-        <w:spacing w:after="80" w:line="276" w:lineRule="auto"/>
-      </w:pPr>
-      <w:r>
-        <w:rPr>
-          <w:rFonts w:ascii="Segoe UI" w:hAnsi="Segoe UI"/>
-          <w:color w:val="334155"/>
-          <w:sz w:val="22"/>
-        </w:rPr>
-        <w:t>Foco no aumento do volume sustentável em Zona 2, introdução a treinos no limiar de lactato (Tempo Run contínuo e fracionado), Fartlek piramidal e queniano, Cruise Intervals no ritmo de 10k/21k e longões com progressão de ritmo (Fast Finish).</w:t>
-      </w:r>
-    </w:p>
-    <w:p>
-      <w:pPr>
-        <w:spacing w:before="200" w:after="80"/>
-      </w:pPr>
-      <w:r>
-        <w:rPr>
-          <w:rFonts w:ascii="Segoe UI" w:hAnsi="Segoe UI"/>
-          <w:b/>
-          <w:color w:val="F59E0B"/>
-          <w:sz w:val="26"/>
-        </w:rPr>
-        <w:t>Nível Avançado (30 Treinos - ID 61 a 90)</w:t>
-      </w:r>
-    </w:p>
-    <w:p>
-      <w:pPr>
-        <w:spacing w:after="80" w:line="276" w:lineRule="auto"/>
-      </w:pPr>
-      <w:r>
-        <w:rPr>
-          <w:rFonts w:ascii="Segoe UI" w:hAnsi="Segoe UI"/>
-          <w:color w:val="334155"/>
-          <w:sz w:val="22"/>
-        </w:rPr>
-        <w:t>Foco em máxima performance, intervalados em pista visando VO2 máximo severo (10x800m, 15x400m), Duplo Limiar Norueguês (4x2000m), Over-Under Tempo Runs, Hill Repeats explosivos e longões estruturados no pace exato de maratona e polimento.</w:t>
+        <w:t>Enquanto o banco de dados JSON estiver vazio, o motor de treinamento (trainingEngine.js) utiliza as descrições limpas e fisiológicas de fallback base, garantindo que o cronograma semanal continue funcional para o corredor com orientações contínuas para cada tipo de sessão (LONG, EASY, INTERVAL, TEMPO, HILL, REST e STRENGTH).</w:t>
       </w:r>
     </w:p>
     <w:p>
@@ -190,7 +109,7 @@
           <w:color w:val="334155"/>
           <w:sz w:val="22"/>
         </w:rPr>
-        <w:t>A Segunda-feira de todos os planos está configurada com o Treino de Fortalecimento Funcional e Mobilidade com marcação de ⭐ Opcional (`isOptional: true`). Dessa forma, o atleta obtém suporte biomecânico contra lesões caso treine, ou descanso completo sem perda de porcentagem no progresso semanal.</w:t>
+        <w:t>A Segunda-feira de todos os planos permanece configurada com o Treino de Fortalecimento Funcional e Mobilidade com marcação de ⭐ Opcional (`isOptional: true`). Dessa forma, o atleta obtém suporte biomecânico contra lesões caso treine, ou descanso completo sem perda de porcentagem no progresso semanal.</w:t>
       </w:r>
     </w:p>
     <w:sectPr>

</xml_diff>

<commit_message>
feat: injeção de dataset científico com 90 planilhas periodizadas (v2.7)
</commit_message>
<xml_diff>
--- a/Documentacao_PlanoDeCorrida.docx
+++ b/Documentacao_PlanoDeCorrida.docx
@@ -28,7 +28,7 @@
           <w:color w:val="334155"/>
           <w:sz w:val="22"/>
         </w:rPr>
-        <w:t>Data: Julho de 2026 | Versão 2.6 (Esvaziamento do Catálogo de Treinos) | Arquitetura: React 18 + Vite + JSON API</w:t>
+        <w:t>Data: Julho de 2026 | Versão 2.7 (Dataset Completo 90 Treinos) | Arquitetura: React 18 + Vite + JSON API</w:t>
       </w:r>
     </w:p>
     <w:p>
@@ -42,7 +42,7 @@
           <w:color w:val="10B981"/>
           <w:sz w:val="32"/>
         </w:rPr>
-        <w:t>1. Esvaziamento e Limpeza do Catálogo (v2.6)</w:t>
+        <w:t>1. Injeção e Consolidação do Dataset de 90 Treinos (v2.7)</w:t>
       </w:r>
     </w:p>
     <w:p>
@@ -55,7 +55,7 @@
           <w:color w:val="334155"/>
           <w:sz w:val="22"/>
         </w:rPr>
-        <w:t>Na versão 2.6, conforme solicitado, todos os treinos do catálogo foram apagados (workouts: []) em workouts_api_catalog.json. O sistema mantém sua arquitetura limpa e pronta para receber uma nova alimentação de dados JSON sem gerar erros na interface ou na compilação.</w:t>
+        <w:t>Na versão 2.7, foi gerado e implementado o banco de dados oficial (workouts_api_catalog.json) com 90 planilhas completas de treinamento de corrida. Cada treino segue o contrato científico de Zonas de Frequência Cardíaca (Z1 a Z5) e Percepção Subjetiva de Esforço (PSE 1 a 10), garantindo integração imediata com o motor semanal e a interface do usuário.</w:t>
       </w:r>
     </w:p>
     <w:p>
@@ -69,7 +69,21 @@
           <w:color w:val="10B981"/>
           <w:sz w:val="32"/>
         </w:rPr>
-        <w:t>2. Estrutura Base de Fallback do Motor de Treinamento</w:t>
+        <w:t>2. Perfil Fisiológico das 90 Planilhas de Treino</w:t>
+      </w:r>
+    </w:p>
+    <w:p>
+      <w:pPr>
+        <w:spacing w:before="200" w:after="80"/>
+      </w:pPr>
+      <w:r>
+        <w:rPr>
+          <w:rFonts w:ascii="Segoe UI" w:hAnsi="Segoe UI"/>
+          <w:b/>
+          <w:color w:val="F59E0B"/>
+          <w:sz w:val="26"/>
+        </w:rPr>
+        <w:t>Nível Iniciante (30 Treinos - ID 1 a 30)</w:t>
       </w:r>
     </w:p>
     <w:p>
@@ -82,7 +96,61 @@
           <w:color w:val="334155"/>
           <w:sz w:val="22"/>
         </w:rPr>
-        <w:t>Enquanto o banco de dados JSON estiver vazio, o motor de treinamento (trainingEngine.js) utiliza as descrições limpas e fisiológicas de fallback base, garantindo que o cronograma semanal continue funcional para o corredor com orientações contínuas para cada tipo de sessão (LONG, EASY, INTERVAL, TEMPO, HILL, REST e STRENGTH).</w:t>
+        <w:t>Foco na adaptação articular e transição Run-Walk (proporções 1:1, 2:1, 3:1, 4:1 e 5:1), estimulação mitocondrial de fibras Tipo I, cadência de proteção articular (175-180 SPM) e consolidação aeróbia em Zona 1/2.</w:t>
+      </w:r>
+    </w:p>
+    <w:p>
+      <w:pPr>
+        <w:spacing w:before="200" w:after="80"/>
+      </w:pPr>
+      <w:r>
+        <w:rPr>
+          <w:rFonts w:ascii="Segoe UI" w:hAnsi="Segoe UI"/>
+          <w:b/>
+          <w:color w:val="F59E0B"/>
+          <w:sz w:val="26"/>
+        </w:rPr>
+        <w:t>Nível Intermediário (30 Treinos - ID 31 a 60)</w:t>
+      </w:r>
+    </w:p>
+    <w:p>
+      <w:pPr>
+        <w:spacing w:after="80" w:line="276" w:lineRule="auto"/>
+      </w:pPr>
+      <w:r>
+        <w:rPr>
+          <w:rFonts w:ascii="Segoe UI" w:hAnsi="Segoe UI"/>
+          <w:color w:val="334155"/>
+          <w:sz w:val="22"/>
+        </w:rPr>
+        <w:t>Aumento do volume em Zona 2, introdução aos treinos no limiar de lactato (Tempo Run contínuo e fracionado em Z3/Z4), Cruise Intervals no pace de 10k/21k, Fartlek queniano e longões progressivos com Fast Finish.</w:t>
+      </w:r>
+    </w:p>
+    <w:p>
+      <w:pPr>
+        <w:spacing w:before="200" w:after="80"/>
+      </w:pPr>
+      <w:r>
+        <w:rPr>
+          <w:rFonts w:ascii="Segoe UI" w:hAnsi="Segoe UI"/>
+          <w:b/>
+          <w:color w:val="F59E0B"/>
+          <w:sz w:val="26"/>
+        </w:rPr>
+        <w:t>Nível Avançado (30 Treinos - ID 61 a 90)</w:t>
+      </w:r>
+    </w:p>
+    <w:p>
+      <w:pPr>
+        <w:spacing w:after="80" w:line="276" w:lineRule="auto"/>
+      </w:pPr>
+      <w:r>
+        <w:rPr>
+          <w:rFonts w:ascii="Segoe UI" w:hAnsi="Segoe UI"/>
+          <w:color w:val="334155"/>
+          <w:sz w:val="22"/>
+        </w:rPr>
+        <w:t>Foco em performance atlética máxima, intervalados em pista visando VO2 máximo severo (10x800m, 15x400m em Z5), Duplo Limiar Norueguês (4x2000m, 5x1600m), Over-Under Tempo Runs e longões de maratona (22 a 28 km) no Race Pace.</w:t>
       </w:r>
     </w:p>
     <w:p>
@@ -109,7 +177,7 @@
           <w:color w:val="334155"/>
           <w:sz w:val="22"/>
         </w:rPr>
-        <w:t>A Segunda-feira de todos os planos permanece configurada com o Treino de Fortalecimento Funcional e Mobilidade com marcação de ⭐ Opcional (`isOptional: true`). Dessa forma, o atleta obtém suporte biomecânico contra lesões caso treine, ou descanso completo sem perda de porcentagem no progresso semanal.</w:t>
+        <w:t>A Segunda-feira permanece configurada com o Treino de Fortalecimento Funcional e Mobilidade com marcação de ⭐ Opcional (`isOptional: true`), preservando a pontuação na barra de progresso em caso de repouso.</w:t>
       </w:r>
     </w:p>
     <w:sectPr>

</xml_diff>